<commit_message>
spring boot interview questions
</commit_message>
<xml_diff>
--- a/Spring_Interview/Spring_Boot_Interview_Questions.docx
+++ b/Spring_Interview/Spring_Boot_Interview_Questions.docx
@@ -1459,9 +1459,132 @@
         <w:t>, etc.) to generate HTML content.</w:t>
       </w:r>
     </w:p>
+    <w:p>
+      <w:r>
+        <w:t xml:space="preserve">To return </w:t>
+      </w:r>
+      <w:r>
+        <w:t>JSON from @</w:t>
+      </w:r>
+      <w:r>
+        <w:t>Controller</w:t>
+      </w:r>
+      <w:r>
+        <w:t>,</w:t>
+      </w:r>
+      <w:r>
+        <w:t xml:space="preserve"> </w:t>
+      </w:r>
+      <w:r>
+        <w:t>you</w:t>
+      </w:r>
+      <w:r>
+        <w:t xml:space="preserve"> must explicitly add @ResponseBody</w:t>
+      </w:r>
+      <w:r>
+        <w:t>.</w:t>
+      </w:r>
+    </w:p>
     <w:p/>
     <w:p>
       <w:r>
+        <w:t>@Controller</w:t>
+      </w:r>
+    </w:p>
+    <w:p>
+      <w:r>
+        <w:t xml:space="preserve">public class </w:t>
+      </w:r>
+      <w:proofErr w:type="spellStart"/>
+      <w:r>
+        <w:t>UserController</w:t>
+      </w:r>
+      <w:proofErr w:type="spellEnd"/>
+      <w:r>
+        <w:t xml:space="preserve"> {</w:t>
+      </w:r>
+    </w:p>
+    <w:p>
+      <w:r>
+        <w:t xml:space="preserve">    @GetMapping("/user")</w:t>
+      </w:r>
+    </w:p>
+    <w:p>
+      <w:r>
+        <w:t xml:space="preserve">    @ResponseBody</w:t>
+      </w:r>
+    </w:p>
+    <w:p>
+      <w:r>
+        <w:t xml:space="preserve">    public User </w:t>
+      </w:r>
+      <w:proofErr w:type="spellStart"/>
+      <w:proofErr w:type="gramStart"/>
+      <w:r>
+        <w:t>getUser</w:t>
+      </w:r>
+      <w:proofErr w:type="spellEnd"/>
+      <w:r>
+        <w:t>(</w:t>
+      </w:r>
+      <w:proofErr w:type="gramEnd"/>
+      <w:r>
+        <w:t>) {</w:t>
+      </w:r>
+    </w:p>
+    <w:p>
+      <w:r>
+        <w:t xml:space="preserve">        return new User("John");</w:t>
+      </w:r>
+    </w:p>
+    <w:p>
+      <w:r>
+        <w:t xml:space="preserve">    }</w:t>
+      </w:r>
+    </w:p>
+    <w:p>
+      <w:r>
+        <w:t>}</w:t>
+      </w:r>
+    </w:p>
+    <w:p/>
+    <w:p>
+      <w:r>
+        <w:t xml:space="preserve">Without </w:t>
+      </w:r>
+      <w:r>
+        <w:rPr>
+          <w:rStyle w:val="HTMLCode"/>
+          <w:rFonts w:eastAsiaTheme="minorHAnsi"/>
+        </w:rPr>
+        <w:t>@ResponseBody</w:t>
+      </w:r>
+      <w:r>
+        <w:t xml:space="preserve">, Spring will try to resolve </w:t>
+      </w:r>
+      <w:r>
+        <w:rPr>
+          <w:rStyle w:val="HTMLCode"/>
+          <w:rFonts w:eastAsiaTheme="minorHAnsi"/>
+        </w:rPr>
+        <w:t>"User"</w:t>
+      </w:r>
+      <w:r>
+        <w:t xml:space="preserve"> as a </w:t>
+      </w:r>
+      <w:r>
+        <w:rPr>
+          <w:rStyle w:val="Strong"/>
+        </w:rPr>
+        <w:t>view</w:t>
+      </w:r>
+      <w:r>
+        <w:t>, which is wrong.</w:t>
+      </w:r>
+    </w:p>
+    <w:p/>
+    <w:p>
+      <w:r>
         <w:t>@RestController</w:t>
       </w:r>
     </w:p>
@@ -1472,9 +1595,17 @@
     </w:p>
     <w:p>
       <w:r>
+        <w:lastRenderedPageBreak/>
         <w:t>Used for building RESTful web services that return data in a format other than HTML, typically JSON or XML.</w:t>
       </w:r>
     </w:p>
+    <w:p/>
+    <w:p>
+      <w:r>
+        <w:t>@RestController = @Controller + @ResponseBody</w:t>
+      </w:r>
+    </w:p>
+    <w:p/>
     <w:p>
       <w:pPr>
         <w:pStyle w:val="Heading1"/>
@@ -1515,56 +1646,56 @@
     <w:p/>
     <w:p>
       <w:r>
+        <w:t>They are available under the spring-boot-starter-* naming convention</w:t>
+      </w:r>
+      <w:r>
+        <w:t>.</w:t>
+      </w:r>
+    </w:p>
+    <w:p>
+      <w:pPr>
+        <w:rPr>
+          <w:u w:val="single"/>
+        </w:rPr>
+      </w:pPr>
+    </w:p>
+    <w:p>
+      <w:pPr>
+        <w:rPr>
+          <w:u w:val="single"/>
+        </w:rPr>
+      </w:pPr>
+    </w:p>
+    <w:p>
+      <w:pPr>
+        <w:rPr>
+          <w:u w:val="single"/>
+        </w:rPr>
+      </w:pPr>
+      <w:r>
+        <w:rPr>
+          <w:u w:val="single"/>
+        </w:rPr>
+        <w:t>Key Features of Spring Boot Starters</w:t>
+      </w:r>
+    </w:p>
+    <w:p>
+      <w:r>
+        <w:rPr>
+          <w:rStyle w:val="Strong"/>
+        </w:rPr>
+        <w:t>Convenience</w:t>
+      </w:r>
+      <w:r>
+        <w:t>: Starters aggregate a group of related dependencies.</w:t>
+      </w:r>
+    </w:p>
+    <w:p>
+      <w:r>
+        <w:rPr>
+          <w:rStyle w:val="Strong"/>
+        </w:rPr>
         <w:lastRenderedPageBreak/>
-        <w:t>They are available under the spring-boot-starter-* naming convention</w:t>
-      </w:r>
-      <w:r>
-        <w:t>.</w:t>
-      </w:r>
-    </w:p>
-    <w:p>
-      <w:pPr>
-        <w:rPr>
-          <w:u w:val="single"/>
-        </w:rPr>
-      </w:pPr>
-    </w:p>
-    <w:p>
-      <w:pPr>
-        <w:rPr>
-          <w:u w:val="single"/>
-        </w:rPr>
-      </w:pPr>
-    </w:p>
-    <w:p>
-      <w:pPr>
-        <w:rPr>
-          <w:u w:val="single"/>
-        </w:rPr>
-      </w:pPr>
-      <w:r>
-        <w:rPr>
-          <w:u w:val="single"/>
-        </w:rPr>
-        <w:t>Key Features of Spring Boot Starters</w:t>
-      </w:r>
-    </w:p>
-    <w:p>
-      <w:r>
-        <w:rPr>
-          <w:rStyle w:val="Strong"/>
-        </w:rPr>
-        <w:t>Convenience</w:t>
-      </w:r>
-      <w:r>
-        <w:t>: Starters aggregate a group of related dependencies.</w:t>
-      </w:r>
-    </w:p>
-    <w:p>
-      <w:r>
-        <w:rPr>
-          <w:rStyle w:val="Strong"/>
-        </w:rPr>
         <w:t>Pre-Configured</w:t>
       </w:r>
       <w:r>
@@ -1729,6 +1860,7 @@
     </w:p>
     <w:p>
       <w:r>
+        <w:lastRenderedPageBreak/>
         <w:t xml:space="preserve">        &lt;version&gt;3.0.2&lt;/version&gt;</w:t>
       </w:r>
     </w:p>
@@ -1831,7 +1963,6 @@
     </w:p>
     <w:p>
       <w:r>
-        <w:lastRenderedPageBreak/>
         <w:t xml:space="preserve">If you do not want to inherit from the Spring Boot Starter Parent, you can use the </w:t>
       </w:r>
       <w:r>
@@ -2311,7 +2442,6 @@
           <w:szCs w:val="21"/>
           <w:shd w:val="clear" w:color="auto" w:fill="FCFCF9"/>
         </w:rPr>
-        <w:lastRenderedPageBreak/>
         <w:t xml:space="preserve">                &lt;version&gt;2.5.4&lt;/version&gt;</w:t>
       </w:r>
     </w:p>
@@ -2628,7 +2758,6 @@
         <w:rPr>
           <w:shd w:val="clear" w:color="auto" w:fill="FCFCF9"/>
         </w:rPr>
-        <w:lastRenderedPageBreak/>
         <w:t xml:space="preserve">3. Include the spring-boot-dependencies dependency inside the </w:t>
       </w:r>
       <w:proofErr w:type="spellStart"/>
@@ -2657,6 +2786,7 @@
         <w:pStyle w:val="Heading1"/>
       </w:pPr>
       <w:r>
+        <w:lastRenderedPageBreak/>
         <w:t>What is Spring Boot CLI and what are its benefits?</w:t>
       </w:r>
     </w:p>
@@ -2806,7 +2936,6 @@
     </w:p>
     <w:p>
       <w:r>
-        <w:lastRenderedPageBreak/>
         <w:t> </w:t>
       </w:r>
     </w:p>
@@ -2891,6 +3020,7 @@
         </w:numPr>
       </w:pPr>
       <w:r>
+        <w:lastRenderedPageBreak/>
         <w:t>Easier testing (mock dependencies)</w:t>
       </w:r>
     </w:p>
@@ -3018,7 +3148,6 @@
     </w:p>
     <w:p>
       <w:r>
-        <w:lastRenderedPageBreak/>
         <w:t>@Component</w:t>
       </w:r>
     </w:p>
@@ -3085,6 +3214,7 @@
     </w:p>
     <w:p>
       <w:r>
+        <w:lastRenderedPageBreak/>
         <w:t>}</w:t>
       </w:r>
     </w:p>
@@ -3167,7 +3297,6 @@
         <w:pStyle w:val="Heading1"/>
       </w:pPr>
       <w:r>
-        <w:lastRenderedPageBreak/>
         <w:t>Bean Scope</w:t>
       </w:r>
     </w:p>
@@ -3414,116 +3543,116 @@
         <w:rPr>
           <w:color w:val="0F9ED5" w:themeColor="accent4"/>
         </w:rPr>
+        <w:t>@Component</w:t>
+      </w:r>
+    </w:p>
+    <w:p>
+      <w:pPr>
+        <w:rPr>
+          <w:color w:val="0F9ED5" w:themeColor="accent4"/>
+        </w:rPr>
+      </w:pPr>
+      <w:r>
+        <w:rPr>
+          <w:color w:val="0F9ED5" w:themeColor="accent4"/>
+        </w:rPr>
+        <w:t>@Scope("prototype")</w:t>
+      </w:r>
+    </w:p>
+    <w:p>
+      <w:pPr>
+        <w:rPr>
+          <w:color w:val="0F9ED5" w:themeColor="accent4"/>
+        </w:rPr>
+      </w:pPr>
+      <w:r>
+        <w:rPr>
+          <w:color w:val="0F9ED5" w:themeColor="accent4"/>
+        </w:rPr>
+        <w:t xml:space="preserve">class </w:t>
+      </w:r>
+      <w:proofErr w:type="spellStart"/>
+      <w:r>
+        <w:rPr>
+          <w:color w:val="0F9ED5" w:themeColor="accent4"/>
+        </w:rPr>
+        <w:t>MyService</w:t>
+      </w:r>
+      <w:proofErr w:type="spellEnd"/>
+      <w:r>
+        <w:rPr>
+          <w:color w:val="0F9ED5" w:themeColor="accent4"/>
+        </w:rPr>
+        <w:t xml:space="preserve"> {}</w:t>
+      </w:r>
+    </w:p>
+    <w:p>
+      <w:pPr>
+        <w:rPr>
+          <w:color w:val="0F9ED5" w:themeColor="accent4"/>
+        </w:rPr>
+      </w:pPr>
+    </w:p>
+    <w:p>
+      <w:pPr>
+        <w:rPr>
+          <w:color w:val="0F9ED5" w:themeColor="accent4"/>
+        </w:rPr>
+      </w:pPr>
+    </w:p>
+    <w:p>
+      <w:pPr>
+        <w:rPr>
+          <w:color w:val="0F9ED5" w:themeColor="accent4"/>
+        </w:rPr>
+      </w:pPr>
+      <w:r>
+        <w:rPr>
+          <w:color w:val="0F9ED5" w:themeColor="accent4"/>
+        </w:rPr>
+        <w:t>@Autowired</w:t>
+      </w:r>
+    </w:p>
+    <w:p>
+      <w:pPr>
+        <w:rPr>
+          <w:color w:val="0F9ED5" w:themeColor="accent4"/>
+        </w:rPr>
+      </w:pPr>
+      <w:proofErr w:type="spellStart"/>
+      <w:r>
+        <w:rPr>
+          <w:color w:val="0F9ED5" w:themeColor="accent4"/>
+        </w:rPr>
+        <w:t>ApplicationContext</w:t>
+      </w:r>
+      <w:proofErr w:type="spellEnd"/>
+      <w:r>
+        <w:rPr>
+          <w:color w:val="0F9ED5" w:themeColor="accent4"/>
+        </w:rPr>
+        <w:t xml:space="preserve"> context;</w:t>
+      </w:r>
+    </w:p>
+    <w:p>
+      <w:pPr>
+        <w:rPr>
+          <w:color w:val="0F9ED5" w:themeColor="accent4"/>
+        </w:rPr>
+      </w:pPr>
+    </w:p>
+    <w:p>
+      <w:pPr>
+        <w:rPr>
+          <w:color w:val="0F9ED5" w:themeColor="accent4"/>
+        </w:rPr>
+      </w:pPr>
+      <w:proofErr w:type="spellStart"/>
+      <w:r>
+        <w:rPr>
+          <w:color w:val="0F9ED5" w:themeColor="accent4"/>
+        </w:rPr>
         <w:lastRenderedPageBreak/>
-        <w:t>@Component</w:t>
-      </w:r>
-    </w:p>
-    <w:p>
-      <w:pPr>
-        <w:rPr>
-          <w:color w:val="0F9ED5" w:themeColor="accent4"/>
-        </w:rPr>
-      </w:pPr>
-      <w:r>
-        <w:rPr>
-          <w:color w:val="0F9ED5" w:themeColor="accent4"/>
-        </w:rPr>
-        <w:t>@Scope("prototype")</w:t>
-      </w:r>
-    </w:p>
-    <w:p>
-      <w:pPr>
-        <w:rPr>
-          <w:color w:val="0F9ED5" w:themeColor="accent4"/>
-        </w:rPr>
-      </w:pPr>
-      <w:r>
-        <w:rPr>
-          <w:color w:val="0F9ED5" w:themeColor="accent4"/>
-        </w:rPr>
-        <w:t xml:space="preserve">class </w:t>
-      </w:r>
-      <w:proofErr w:type="spellStart"/>
-      <w:r>
-        <w:rPr>
-          <w:color w:val="0F9ED5" w:themeColor="accent4"/>
-        </w:rPr>
-        <w:t>MyService</w:t>
-      </w:r>
-      <w:proofErr w:type="spellEnd"/>
-      <w:r>
-        <w:rPr>
-          <w:color w:val="0F9ED5" w:themeColor="accent4"/>
-        </w:rPr>
-        <w:t xml:space="preserve"> {}</w:t>
-      </w:r>
-    </w:p>
-    <w:p>
-      <w:pPr>
-        <w:rPr>
-          <w:color w:val="0F9ED5" w:themeColor="accent4"/>
-        </w:rPr>
-      </w:pPr>
-    </w:p>
-    <w:p>
-      <w:pPr>
-        <w:rPr>
-          <w:color w:val="0F9ED5" w:themeColor="accent4"/>
-        </w:rPr>
-      </w:pPr>
-    </w:p>
-    <w:p>
-      <w:pPr>
-        <w:rPr>
-          <w:color w:val="0F9ED5" w:themeColor="accent4"/>
-        </w:rPr>
-      </w:pPr>
-      <w:r>
-        <w:rPr>
-          <w:color w:val="0F9ED5" w:themeColor="accent4"/>
-        </w:rPr>
-        <w:t>@Autowired</w:t>
-      </w:r>
-    </w:p>
-    <w:p>
-      <w:pPr>
-        <w:rPr>
-          <w:color w:val="0F9ED5" w:themeColor="accent4"/>
-        </w:rPr>
-      </w:pPr>
-      <w:proofErr w:type="spellStart"/>
-      <w:r>
-        <w:rPr>
-          <w:color w:val="0F9ED5" w:themeColor="accent4"/>
-        </w:rPr>
-        <w:t>ApplicationContext</w:t>
-      </w:r>
-      <w:proofErr w:type="spellEnd"/>
-      <w:r>
-        <w:rPr>
-          <w:color w:val="0F9ED5" w:themeColor="accent4"/>
-        </w:rPr>
-        <w:t xml:space="preserve"> context;</w:t>
-      </w:r>
-    </w:p>
-    <w:p>
-      <w:pPr>
-        <w:rPr>
-          <w:color w:val="0F9ED5" w:themeColor="accent4"/>
-        </w:rPr>
-      </w:pPr>
-    </w:p>
-    <w:p>
-      <w:pPr>
-        <w:rPr>
-          <w:color w:val="0F9ED5" w:themeColor="accent4"/>
-        </w:rPr>
-      </w:pPr>
-      <w:proofErr w:type="spellStart"/>
-      <w:r>
-        <w:rPr>
-          <w:color w:val="0F9ED5" w:themeColor="accent4"/>
-        </w:rPr>
         <w:t>MyService</w:t>
       </w:r>
       <w:proofErr w:type="spellEnd"/>
@@ -3742,80 +3871,80 @@
         <w:rPr>
           <w:u w:val="single"/>
         </w:rPr>
+        <w:t xml:space="preserve">Flow </w:t>
+      </w:r>
+    </w:p>
+    <w:p>
+      <w:r>
+        <w:rPr>
+          <w:b/>
+          <w:bCs/>
+        </w:rPr>
+        <w:t>Bean Created</w:t>
+      </w:r>
+      <w:r>
+        <w:t xml:space="preserve"> (constructor called)</w:t>
+      </w:r>
+    </w:p>
+    <w:p>
+      <w:r>
+        <w:rPr>
+          <w:b/>
+          <w:bCs/>
+        </w:rPr>
+        <w:t xml:space="preserve">Dependencies Injected: </w:t>
+      </w:r>
+      <w:r>
+        <w:t>Spring injects the dependencies (DI) into the bean.</w:t>
+      </w:r>
+    </w:p>
+    <w:p>
+      <w:r>
+        <w:rPr>
+          <w:b/>
+          <w:bCs/>
+        </w:rPr>
+        <w:t xml:space="preserve">Initialization:  </w:t>
+      </w:r>
+      <w:r>
+        <w:t xml:space="preserve">This is where the bean is "readied" for </w:t>
+      </w:r>
+      <w:r>
+        <w:t>work,</w:t>
+      </w:r>
+      <w:r>
+        <w:t xml:space="preserve"> use the hook @PostConstruct to check this.</w:t>
+      </w:r>
+    </w:p>
+    <w:p>
+      <w:r>
+        <w:rPr>
+          <w:b/>
+          <w:bCs/>
+        </w:rPr>
+        <w:t xml:space="preserve">In Use: </w:t>
+      </w:r>
+      <w:r>
+        <w:t>Being</w:t>
+      </w:r>
+      <w:r>
+        <w:rPr>
+          <w:b/>
+          <w:bCs/>
+        </w:rPr>
+        <w:t xml:space="preserve"> </w:t>
+      </w:r>
+      <w:r>
+        <w:t xml:space="preserve">used by the app </w:t>
+      </w:r>
+    </w:p>
+    <w:p>
+      <w:r>
+        <w:rPr>
+          <w:b/>
+          <w:bCs/>
+        </w:rPr>
         <w:lastRenderedPageBreak/>
-        <w:t xml:space="preserve">Flow </w:t>
-      </w:r>
-    </w:p>
-    <w:p>
-      <w:r>
-        <w:rPr>
-          <w:b/>
-          <w:bCs/>
-        </w:rPr>
-        <w:t>Bean Created</w:t>
-      </w:r>
-      <w:r>
-        <w:t xml:space="preserve"> (constructor called)</w:t>
-      </w:r>
-    </w:p>
-    <w:p>
-      <w:r>
-        <w:rPr>
-          <w:b/>
-          <w:bCs/>
-        </w:rPr>
-        <w:t xml:space="preserve">Dependencies Injected: </w:t>
-      </w:r>
-      <w:r>
-        <w:t>Spring injects the dependencies (DI) into the bean.</w:t>
-      </w:r>
-    </w:p>
-    <w:p>
-      <w:r>
-        <w:rPr>
-          <w:b/>
-          <w:bCs/>
-        </w:rPr>
-        <w:t xml:space="preserve">Initialization:  </w:t>
-      </w:r>
-      <w:r>
-        <w:t xml:space="preserve">This is where the bean is "readied" for </w:t>
-      </w:r>
-      <w:r>
-        <w:t>work,</w:t>
-      </w:r>
-      <w:r>
-        <w:t xml:space="preserve"> use the hook @PostConstruct to check this.</w:t>
-      </w:r>
-    </w:p>
-    <w:p>
-      <w:r>
-        <w:rPr>
-          <w:b/>
-          <w:bCs/>
-        </w:rPr>
-        <w:t xml:space="preserve">In Use: </w:t>
-      </w:r>
-      <w:r>
-        <w:t>Being</w:t>
-      </w:r>
-      <w:r>
-        <w:rPr>
-          <w:b/>
-          <w:bCs/>
-        </w:rPr>
-        <w:t xml:space="preserve"> </w:t>
-      </w:r>
-      <w:r>
-        <w:t xml:space="preserve">used by the app </w:t>
-      </w:r>
-    </w:p>
-    <w:p>
-      <w:r>
-        <w:rPr>
-          <w:b/>
-          <w:bCs/>
-        </w:rPr>
         <w:t>Destruction</w:t>
       </w:r>
       <w:r>
@@ -6156,7 +6285,6 @@
   <w:style w:type="character" w:default="1" w:styleId="DefaultParagraphFont">
     <w:name w:val="Default Paragraph Font"/>
     <w:uiPriority w:val="1"/>
-    <w:semiHidden/>
     <w:unhideWhenUsed/>
   </w:style>
   <w:style w:type="table" w:default="1" w:styleId="TableNormal">

</xml_diff>